<commit_message>
v20 save before changing
</commit_message>
<xml_diff>
--- a/src/main/resources/org/example/parser/отчет_Гмерина.docx
+++ b/src/main/resources/org/example/parser/отчет_Гмерина.docx
@@ -1535,7 +1535,7 @@
         <w:rPr>
           <w:lang w:val="ru-RU"/>
         </w:rPr>
-        <w:t>В связи с разработанной автоматной грамматикой G[&lt;F&gt;] парсер оператора цикла while будет считать верными следующие записи:</w:t>
+        <w:t>В связи с разработанной автоматной грамматикой G[&lt;F&gt;] оператора цикла while будет считать верными следующие записи:</w:t>
       </w:r>
     </w:p>
     <w:p>
@@ -1568,7 +1568,19 @@
         <w:rPr>
           <w:lang w:val="ru-RU"/>
         </w:rPr>
-        <w:t>while (3) { x=3;}</w:t>
+        <w:t>while (3!</w:t>
+      </w:r>
+      <w:r>
+        <w:rPr>
+          <w:lang w:val="ru-RU"/>
+        </w:rPr>
+        <w:t>=8-m</w:t>
+      </w:r>
+      <w:r>
+        <w:rPr>
+          <w:lang w:val="ru-RU"/>
+        </w:rPr>
+        <w:t>) { x=3;}</w:t>
       </w:r>
     </w:p>
     <w:p>
@@ -1642,7 +1654,19 @@
         <w:rPr>
           <w:lang w:val="ru-RU"/>
         </w:rPr>
-        <w:t>while (5==5) { a=6; }</w:t>
+        <w:t>while (5==5) { a=6</w:t>
+      </w:r>
+      <w:r>
+        <w:rPr>
+          <w:lang w:val="ru-RU"/>
+        </w:rPr>
+        <w:t>*7+y</w:t>
+      </w:r>
+      <w:r>
+        <w:rPr>
+          <w:lang w:val="ru-RU"/>
+        </w:rPr>
+        <w:t>; }</w:t>
       </w:r>
     </w:p>
     <w:p>
@@ -2386,19 +2410,7 @@
         <w:rPr>
           <w:lang w:val="en-US" w:bidi="ar-SA"/>
         </w:rPr>
-        <w:t>5) &lt;AS&gt;  → &lt;</w:t>
-      </w:r>
-      <w:r>
-        <w:rPr>
-          <w:lang w:val="en-US" w:bidi="ar-SA"/>
-        </w:rPr>
-        <w:t>VAR</w:t>
-      </w:r>
-      <w:r>
-        <w:rPr>
-          <w:lang w:val="en-US" w:bidi="ar-SA"/>
-        </w:rPr>
-        <w:t>&gt; = &lt;E&gt;</w:t>
+        <w:t>5) &lt;AS&gt;  → &lt;VAR&gt; = &lt;E&gt;</w:t>
       </w:r>
     </w:p>
     <w:p>
@@ -2413,19 +2425,7 @@
         <w:rPr>
           <w:lang w:val="en-US" w:bidi="ar-SA"/>
         </w:rPr>
-        <w:t>6) &lt;E&gt;   → &lt;T&gt; &lt;</w:t>
-      </w:r>
-      <w:r>
-        <w:rPr>
-          <w:lang w:val="en-US" w:bidi="ar-SA"/>
-        </w:rPr>
-        <w:t>A</w:t>
-      </w:r>
-      <w:r>
-        <w:rPr>
-          <w:lang w:val="en-US" w:bidi="ar-SA"/>
-        </w:rPr>
-        <w:t>&gt;</w:t>
+        <w:t>6) &lt;E&gt;   → &lt;T&gt; &lt;A&gt;</w:t>
       </w:r>
     </w:p>
     <w:p>
@@ -2440,43 +2440,7 @@
         <w:rPr>
           <w:lang w:val="en-US" w:bidi="ar-SA"/>
         </w:rPr>
-        <w:t>7) &lt;</w:t>
-      </w:r>
-      <w:r>
-        <w:rPr>
-          <w:lang w:val="en-US" w:bidi="ar-SA"/>
-        </w:rPr>
-        <w:t>A</w:t>
-      </w:r>
-      <w:r>
-        <w:rPr>
-          <w:lang w:val="en-US" w:bidi="ar-SA"/>
-        </w:rPr>
-        <w:t>&gt;   → + &lt;T&gt; &lt;</w:t>
-      </w:r>
-      <w:r>
-        <w:rPr>
-          <w:lang w:val="en-US" w:bidi="ar-SA"/>
-        </w:rPr>
-        <w:t>A</w:t>
-      </w:r>
-      <w:r>
-        <w:rPr>
-          <w:lang w:val="en-US" w:bidi="ar-SA"/>
-        </w:rPr>
-        <w:t>&gt; | - &lt;T&gt; &lt;</w:t>
-      </w:r>
-      <w:r>
-        <w:rPr>
-          <w:lang w:val="en-US" w:bidi="ar-SA"/>
-        </w:rPr>
-        <w:t>A</w:t>
-      </w:r>
-      <w:r>
-        <w:rPr>
-          <w:lang w:val="en-US" w:bidi="ar-SA"/>
-        </w:rPr>
-        <w:t>&gt; | ε</w:t>
+        <w:t>7) &lt;A&gt;   → + &lt;T&gt; &lt;A&gt; | - &lt;T&gt; &lt;A&gt; | ε</w:t>
       </w:r>
     </w:p>
     <w:p>
@@ -2491,19 +2455,7 @@
         <w:rPr>
           <w:lang w:val="en-US" w:bidi="ar-SA"/>
         </w:rPr>
-        <w:t>8) &lt;T&gt;   → &lt;O&gt; &lt;</w:t>
-      </w:r>
-      <w:r>
-        <w:rPr>
-          <w:lang w:val="en-US" w:bidi="ar-SA"/>
-        </w:rPr>
-        <w:t>M</w:t>
-      </w:r>
-      <w:r>
-        <w:rPr>
-          <w:lang w:val="en-US" w:bidi="ar-SA"/>
-        </w:rPr>
-        <w:t>&gt;</w:t>
+        <w:t>8) &lt;T&gt;   → &lt;O&gt; &lt;M&gt;</w:t>
       </w:r>
     </w:p>
     <w:p>
@@ -2518,43 +2470,7 @@
         <w:rPr>
           <w:lang w:val="en-US" w:bidi="ar-SA"/>
         </w:rPr>
-        <w:t>9) &lt;</w:t>
-      </w:r>
-      <w:r>
-        <w:rPr>
-          <w:lang w:val="en-US" w:bidi="ar-SA"/>
-        </w:rPr>
-        <w:t>M</w:t>
-      </w:r>
-      <w:r>
-        <w:rPr>
-          <w:lang w:val="en-US" w:bidi="ar-SA"/>
-        </w:rPr>
-        <w:t>&gt;   → * &lt;O&gt; &lt;</w:t>
-      </w:r>
-      <w:r>
-        <w:rPr>
-          <w:lang w:val="en-US" w:bidi="ar-SA"/>
-        </w:rPr>
-        <w:t>M</w:t>
-      </w:r>
-      <w:r>
-        <w:rPr>
-          <w:lang w:val="en-US" w:bidi="ar-SA"/>
-        </w:rPr>
-        <w:t>&gt; | / &lt;O&gt; &lt;</w:t>
-      </w:r>
-      <w:r>
-        <w:rPr>
-          <w:lang w:val="en-US" w:bidi="ar-SA"/>
-        </w:rPr>
-        <w:t>M</w:t>
-      </w:r>
-      <w:r>
-        <w:rPr>
-          <w:lang w:val="en-US" w:bidi="ar-SA"/>
-        </w:rPr>
-        <w:t>&gt; | ε</w:t>
+        <w:t>9) &lt;M&gt;   → * &lt;O&gt; &lt;M&gt; | / &lt;O&gt; &lt;M&gt; | ε</w:t>
       </w:r>
     </w:p>
     <w:p>
@@ -2569,19 +2485,7 @@
         <w:rPr>
           <w:lang w:val="en-US" w:bidi="ar-SA"/>
         </w:rPr>
-        <w:t>10) &lt;O&gt;  → &lt;</w:t>
-      </w:r>
-      <w:r>
-        <w:rPr>
-          <w:lang w:val="en-US" w:bidi="ar-SA"/>
-        </w:rPr>
-        <w:t>VAR</w:t>
-      </w:r>
-      <w:r>
-        <w:rPr>
-          <w:lang w:val="en-US" w:bidi="ar-SA"/>
-        </w:rPr>
-        <w:t>&gt; | &lt;NUM&gt; | ( &lt;E&gt; )</w:t>
+        <w:t>10) &lt;O&gt;  → &lt;VAR&gt; | &lt;NUM&gt; | ( &lt;E&gt; )</w:t>
       </w:r>
     </w:p>
     <w:p>
@@ -2626,31 +2530,7 @@
         <w:rPr>
           <w:lang w:val="en-US" w:bidi="ar-SA"/>
         </w:rPr>
-        <w:t>13) &lt;</w:t>
-      </w:r>
-      <w:r>
-        <w:rPr>
-          <w:lang w:val="en-US" w:bidi="ar-SA"/>
-        </w:rPr>
-        <w:t>VAR</w:t>
-      </w:r>
-      <w:r>
-        <w:rPr>
-          <w:lang w:val="en-US" w:bidi="ar-SA"/>
-        </w:rPr>
-        <w:t>&gt; → letter &lt;</w:t>
-      </w:r>
-      <w:r>
-        <w:rPr>
-          <w:lang w:val="en-US" w:bidi="ar-SA"/>
-        </w:rPr>
-        <w:t>VAR</w:t>
-      </w:r>
-      <w:r>
-        <w:rPr>
-          <w:lang w:val="en-US" w:bidi="ar-SA"/>
-        </w:rPr>
-        <w:t>_TAIL&gt;</w:t>
+        <w:t>13) &lt;VAR&gt; → letter &lt;VAR_TAIL&gt;</w:t>
       </w:r>
     </w:p>
     <w:p>
@@ -2665,19 +2545,7 @@
         <w:rPr>
           <w:lang w:val="en-US" w:bidi="ar-SA"/>
         </w:rPr>
-        <w:t>14) &lt;</w:t>
-      </w:r>
-      <w:r>
-        <w:rPr>
-          <w:lang w:val="en-US" w:bidi="ar-SA"/>
-        </w:rPr>
-        <w:t>VAR</w:t>
-      </w:r>
-      <w:r>
-        <w:rPr>
-          <w:lang w:val="en-US" w:bidi="ar-SA"/>
-        </w:rPr>
-        <w:t>_TAIL&gt; → letter | digit | ε</w:t>
+        <w:t>14) &lt;VAR_TAIL&gt; → letter | digit | ε</w:t>
       </w:r>
     </w:p>
     <w:p>
@@ -2891,63 +2759,7 @@
           <w:color w:val="000000"/>
           <w:lang w:val="en-US" w:bidi="ar-SA"/>
         </w:rPr>
-        <w:t xml:space="preserve"> = {&lt;W&gt;, &lt;C&gt;, &lt;E&gt;, &lt;T&gt;, &lt;</w:t>
-      </w:r>
-      <w:r>
-        <w:rPr>
-          <w:color w:val="000000"/>
-          <w:lang w:val="en-US" w:bidi="ar-SA"/>
-        </w:rPr>
-        <w:t>M</w:t>
-      </w:r>
-      <w:r>
-        <w:rPr>
-          <w:color w:val="000000"/>
-          <w:lang w:val="en-US" w:bidi="ar-SA"/>
-        </w:rPr>
-        <w:t>&gt;, &lt;</w:t>
-      </w:r>
-      <w:r>
-        <w:rPr>
-          <w:color w:val="000000"/>
-          <w:lang w:val="en-US" w:bidi="ar-SA"/>
-        </w:rPr>
-        <w:t>A</w:t>
-      </w:r>
-      <w:r>
-        <w:rPr>
-          <w:color w:val="000000"/>
-          <w:lang w:val="en-US" w:bidi="ar-SA"/>
-        </w:rPr>
-        <w:t>&gt;, &lt;O&gt;, &lt;S&gt;, &lt;SL&gt;, &lt;AS&gt;, &lt;</w:t>
-      </w:r>
-      <w:r>
-        <w:rPr>
-          <w:color w:val="000000"/>
-          <w:lang w:val="en-US" w:bidi="ar-SA"/>
-        </w:rPr>
-        <w:t>VAR</w:t>
-      </w:r>
-      <w:r>
-        <w:rPr>
-          <w:color w:val="000000"/>
-          <w:lang w:val="en-US" w:bidi="ar-SA"/>
-        </w:rPr>
-        <w:t>&gt;, &lt;</w:t>
-      </w:r>
-      <w:r>
-        <w:rPr>
-          <w:color w:val="000000"/>
-          <w:lang w:val="en-US" w:bidi="ar-SA"/>
-        </w:rPr>
-        <w:t>VAR</w:t>
-      </w:r>
-      <w:r>
-        <w:rPr>
-          <w:color w:val="000000"/>
-          <w:lang w:val="en-US" w:bidi="ar-SA"/>
-        </w:rPr>
-        <w:t>_TAIL&gt;, &lt;NUM&gt;, &lt;NUM_TAIL&gt;, &lt;CMP&gt;, &lt;END&gt;}.</w:t>
+        <w:t xml:space="preserve"> = {&lt;W&gt;, &lt;C&gt;, &lt;E&gt;, &lt;T&gt;, &lt;M&gt;, &lt;A&gt;, &lt;O&gt;, &lt;S&gt;, &lt;SL&gt;, &lt;AS&gt;, &lt;VAR&gt;, &lt;VAR_TAIL&gt;, &lt;NUM&gt;, &lt;NUM_TAIL&gt;, &lt;CMP&gt;, &lt;END&gt;}.</w:t>
       </w:r>
     </w:p>
     <w:p>
@@ -3118,8 +2930,8 @@
         <w:jc w:val="both"/>
         <w:rPr/>
       </w:pPr>
-      <w:bookmarkStart w:id="4" w:name="_Toc211376660"/>
-      <w:bookmarkStart w:id="5" w:name="_Toc69940114"/>
+      <w:bookmarkStart w:id="4" w:name="_Toc69940114"/>
+      <w:bookmarkStart w:id="5" w:name="_Toc211376660"/>
       <w:r>
         <w:rPr/>
         <w:t>3 Классификация грамматики</w:t>
@@ -18415,7 +18227,7 @@
     <w:pPr>
       <w:widowControl/>
       <w:suppressAutoHyphens w:val="true"/>
-      <w:overflowPunct w:val="false"/>
+      <w:overflowPunct w:val="true"/>
       <w:bidi w:val="0"/>
       <w:spacing w:before="0" w:after="0"/>
       <w:ind w:firstLine="567" w:start="0" w:end="0"/>
@@ -18720,7 +18532,7 @@
     <w:pPr>
       <w:widowControl/>
       <w:suppressAutoHyphens w:val="true"/>
-      <w:overflowPunct w:val="false"/>
+      <w:overflowPunct w:val="true"/>
       <w:bidi w:val="0"/>
       <w:spacing w:before="0" w:after="0"/>
       <w:jc w:val="start"/>

</xml_diff>